<commit_message>
Update CV with real campaign metrics and HT projection model
- Added documented LT funnel case: $0.52 CPL, 6.24% CTR, 1.93x ROAS
- Added strategic HT projection based on same fundamentals
- Enhanced results section with concrete numbers

Co-Authored-By: Claude Opus 4.6 <noreply@anthropic.com>
Claude-Session: https://claude.ai/code/session_01XyhqfmH114sHU8jizAj9nA
</commit_message>
<xml_diff>
--- a/Marco_Suniaga_CV.docx
+++ b/Marco_Suniaga_CV.docx
@@ -233,61 +233,102 @@
           <w:sz w:val="20"/>
           <w:szCs w:val="20"/>
         </w:rPr>
-        <w:t xml:space="preserve">Lanzamientos ejecutados: </w:t>
-      </w:r>
-      <w:r>
-        <w:rPr>
-          <w:rFonts w:ascii="Calibri" w:cs="Calibri" w:eastAsia="Calibri" w:hAnsi="Calibri"/>
-          <w:b w:val="false"/>
-          <w:bCs w:val="false"/>
-          <w:i w:val="false"/>
-          <w:iCs w:val="false"/>
-          <w:color w:val="3a3a3a"/>
-          <w:sz w:val="20"/>
-          <w:szCs w:val="20"/>
-        </w:rPr>
-        <w:t xml:space="preserve">Sistema propio de lanzamientos end-to-end desde low-ticket hasta high-ticket, aplicado a múltiples emprendedores digitales desde 2019.</w:t>
-      </w:r>
-    </w:p>
-    <w:p>
-      <w:pPr>
-        <w:spacing w:after="50"/>
-        <w:ind w:left="360"/>
-      </w:pPr>
-      <w:r>
-        <w:rPr>
-          <w:rFonts w:ascii="Calibri" w:cs="Calibri" w:eastAsia="Calibri" w:hAnsi="Calibri"/>
-          <w:color w:val="2d5f8a"/>
-          <w:sz w:val="20"/>
-          <w:szCs w:val="20"/>
-        </w:rPr>
-        <w:t xml:space="preserve">▸ </w:t>
-      </w:r>
-      <w:r>
-        <w:rPr>
-          <w:rFonts w:ascii="Calibri" w:cs="Calibri" w:eastAsia="Calibri" w:hAnsi="Calibri"/>
-          <w:b/>
-          <w:bCs/>
-          <w:i w:val="false"/>
-          <w:iCs w:val="false"/>
-          <w:color w:val="1a1a2e"/>
-          <w:sz w:val="20"/>
-          <w:szCs w:val="20"/>
-        </w:rPr>
-        <w:t xml:space="preserve">Gestión de campañas: </w:t>
-      </w:r>
-      <w:r>
-        <w:rPr>
-          <w:rFonts w:ascii="Calibri" w:cs="Calibri" w:eastAsia="Calibri" w:hAnsi="Calibri"/>
-          <w:b w:val="false"/>
-          <w:bCs w:val="false"/>
-          <w:i w:val="false"/>
-          <w:iCs w:val="false"/>
-          <w:color w:val="3a3a3a"/>
-          <w:sz w:val="20"/>
-          <w:szCs w:val="20"/>
-        </w:rPr>
-        <w:t xml:space="preserve">Diseño, ejecución y optimización de campañas de tráfico pago (Meta Ads) con presupuestos variables para nichos de coaching, desarrollo personal y formación online.</w:t>
+        <w:t xml:space="preserve">Caso de lanzamiento Low Ticket (funnel completo desde cero): </w:t>
+      </w:r>
+      <w:r>
+        <w:rPr>
+          <w:rFonts w:ascii="Calibri" w:cs="Calibri" w:eastAsia="Calibri" w:hAnsi="Calibri"/>
+          <w:b w:val="false"/>
+          <w:bCs w:val="false"/>
+          <w:i w:val="false"/>
+          <w:iCs w:val="false"/>
+          <w:color w:val="3a3a3a"/>
+          <w:sz w:val="20"/>
+          <w:szCs w:val="20"/>
+        </w:rPr>
+        <w:t xml:space="preserve">105 leads con CPL de $0.52 | CTR 6.24% | 15 ventas | ROAS 1.93x | Costo por venta: $3.63 — con solo $54.43 de inversión en Meta Ads.</w:t>
+      </w:r>
+    </w:p>
+    <w:p>
+      <w:pPr>
+        <w:spacing w:after="50"/>
+        <w:ind w:left="360"/>
+      </w:pPr>
+      <w:r>
+        <w:rPr>
+          <w:rFonts w:ascii="Calibri" w:cs="Calibri" w:eastAsia="Calibri" w:hAnsi="Calibri"/>
+          <w:color w:val="2d5f8a"/>
+          <w:sz w:val="20"/>
+          <w:szCs w:val="20"/>
+        </w:rPr>
+        <w:t xml:space="preserve">▸ </w:t>
+      </w:r>
+      <w:r>
+        <w:rPr>
+          <w:rFonts w:ascii="Calibri" w:cs="Calibri" w:eastAsia="Calibri" w:hAnsi="Calibri"/>
+          <w:b/>
+          <w:bCs/>
+          <w:i w:val="false"/>
+          <w:iCs w:val="false"/>
+          <w:color w:val="1a1a2e"/>
+          <w:sz w:val="20"/>
+          <w:szCs w:val="20"/>
+        </w:rPr>
+        <w:t xml:space="preserve">Funnel end-to-end: </w:t>
+      </w:r>
+      <w:r>
+        <w:rPr>
+          <w:rFonts w:ascii="Calibri" w:cs="Calibri" w:eastAsia="Calibri" w:hAnsi="Calibri"/>
+          <w:b w:val="false"/>
+          <w:bCs w:val="false"/>
+          <w:i w:val="false"/>
+          <w:iCs w:val="false"/>
+          <w:color w:val="3a3a3a"/>
+          <w:sz w:val="20"/>
+          <w:szCs w:val="20"/>
+        </w:rPr>
+        <w:t xml:space="preserve">Estrategia de marca personal, guiones, contenido orgánico, producto LT, página de captura, página de gracias, VSL, campaña Meta y seguimiento vía comunidad WhatsApp (14 días).</w:t>
+      </w:r>
+    </w:p>
+    <w:p>
+      <w:pPr>
+        <w:spacing w:after="50"/>
+        <w:ind w:left="360"/>
+      </w:pPr>
+      <w:r>
+        <w:rPr>
+          <w:rFonts w:ascii="Calibri" w:cs="Calibri" w:eastAsia="Calibri" w:hAnsi="Calibri"/>
+          <w:color w:val="2d5f8a"/>
+          <w:sz w:val="20"/>
+          <w:szCs w:val="20"/>
+        </w:rPr>
+        <w:t xml:space="preserve">▸ </w:t>
+      </w:r>
+      <w:r>
+        <w:rPr>
+          <w:rFonts w:ascii="Calibri" w:cs="Calibri" w:eastAsia="Calibri" w:hAnsi="Calibri"/>
+          <w:b/>
+          <w:bCs/>
+          <w:i w:val="false"/>
+          <w:iCs w:val="false"/>
+          <w:color w:val="1a1a2e"/>
+          <w:sz w:val="20"/>
+          <w:szCs w:val="20"/>
+        </w:rPr>
+        <w:t xml:space="preserve">Análisis de datos en campaña real: </w:t>
+      </w:r>
+      <w:r>
+        <w:rPr>
+          <w:rFonts w:ascii="Calibri" w:cs="Calibri" w:eastAsia="Calibri" w:hAnsi="Calibri"/>
+          <w:b w:val="false"/>
+          <w:bCs w:val="false"/>
+          <w:i w:val="false"/>
+          <w:iCs w:val="false"/>
+          <w:color w:val="3a3a3a"/>
+          <w:sz w:val="20"/>
+          <w:szCs w:val="20"/>
+        </w:rPr>
+        <w:t xml:space="preserve">Detección de patrones de rendimiento ante interrupciones de campaña (pausas por problemas de pago), demostrando que la continuidad era un factor clave en el CPL.</w:t>
       </w:r>
     </w:p>
     <w:p>
@@ -1092,6 +1133,538 @@
           <w:szCs w:val="20"/>
         </w:rPr>
         <w:t xml:space="preserve">Proceso de venta consultiva, manejo de objeciones, follow-up y cierre high-ticket.</w:t>
+      </w:r>
+    </w:p>
+    <w:p>
+      <w:pPr>
+        <w:pBdr>
+          <w:bottom w:val="single" w:color="2d5f8a" w:sz="6"/>
+        </w:pBdr>
+        <w:spacing w:after="40" w:before="300"/>
+      </w:pPr>
+      <w:r>
+        <w:rPr>
+          <w:rFonts w:ascii="Calibri" w:cs="Calibri" w:eastAsia="Calibri" w:hAnsi="Calibri"/>
+          <w:b/>
+          <w:bCs/>
+          <w:color w:val="2d5f8a"/>
+          <w:sz w:val="22"/>
+          <w:szCs w:val="22"/>
+        </w:rPr>
+        <w:t xml:space="preserve">CASO DOCUMENTADO: FUNNEL COMPLETO LOW TICKET → MODELO DE ESCALADO HIGH TICKET</w:t>
+      </w:r>
+    </w:p>
+    <w:p>
+      <w:pPr>
+        <w:spacing w:after="100" w:before="0"/>
+        <w:jc w:val="left"/>
+      </w:pPr>
+      <w:r>
+        <w:rPr>
+          <w:rFonts w:ascii="Calibri" w:cs="Calibri" w:eastAsia="Calibri" w:hAnsi="Calibri"/>
+          <w:b w:val="false"/>
+          <w:bCs w:val="false"/>
+          <w:i w:val="false"/>
+          <w:iCs w:val="false"/>
+          <w:color w:val="3a3a3a"/>
+          <w:sz w:val="20"/>
+          <w:szCs w:val="20"/>
+        </w:rPr>
+        <w:t xml:space="preserve">Lanzamiento ejecutado desde cero para emprendedor digital — incluyendo estrategia de marca personal, contenido orgánico, producto Low Ticket, VSL, campaña Meta y comunidad de seguimiento:</w:t>
+      </w:r>
+    </w:p>
+    <w:p>
+      <w:pPr>
+        <w:spacing w:after="50"/>
+        <w:ind w:left="360"/>
+      </w:pPr>
+      <w:r>
+        <w:rPr>
+          <w:rFonts w:ascii="Calibri" w:cs="Calibri" w:eastAsia="Calibri" w:hAnsi="Calibri"/>
+          <w:color w:val="2d5f8a"/>
+          <w:sz w:val="20"/>
+          <w:szCs w:val="20"/>
+        </w:rPr>
+        <w:t xml:space="preserve">▸ </w:t>
+      </w:r>
+      <w:r>
+        <w:rPr>
+          <w:rFonts w:ascii="Calibri" w:cs="Calibri" w:eastAsia="Calibri" w:hAnsi="Calibri"/>
+          <w:b/>
+          <w:bCs/>
+          <w:i w:val="false"/>
+          <w:iCs w:val="false"/>
+          <w:color w:val="1a1a2e"/>
+          <w:sz w:val="20"/>
+          <w:szCs w:val="20"/>
+        </w:rPr>
+        <w:t xml:space="preserve">Inversión: </w:t>
+      </w:r>
+      <w:r>
+        <w:rPr>
+          <w:rFonts w:ascii="Calibri" w:cs="Calibri" w:eastAsia="Calibri" w:hAnsi="Calibri"/>
+          <w:b w:val="false"/>
+          <w:bCs w:val="false"/>
+          <w:i w:val="false"/>
+          <w:iCs w:val="false"/>
+          <w:color w:val="3a3a3a"/>
+          <w:sz w:val="20"/>
+          <w:szCs w:val="20"/>
+        </w:rPr>
+        <w:t xml:space="preserve">$54.43  |  </w:t>
+      </w:r>
+      <w:r>
+        <w:rPr>
+          <w:rFonts w:ascii="Calibri" w:cs="Calibri" w:eastAsia="Calibri" w:hAnsi="Calibri"/>
+          <w:b/>
+          <w:bCs/>
+          <w:i w:val="false"/>
+          <w:iCs w:val="false"/>
+          <w:color w:val="1a1a2e"/>
+          <w:sz w:val="20"/>
+          <w:szCs w:val="20"/>
+        </w:rPr>
+        <w:t xml:space="preserve">Leads: </w:t>
+      </w:r>
+      <w:r>
+        <w:rPr>
+          <w:rFonts w:ascii="Calibri" w:cs="Calibri" w:eastAsia="Calibri" w:hAnsi="Calibri"/>
+          <w:b w:val="false"/>
+          <w:bCs w:val="false"/>
+          <w:i w:val="false"/>
+          <w:iCs w:val="false"/>
+          <w:color w:val="3a3a3a"/>
+          <w:sz w:val="20"/>
+          <w:szCs w:val="20"/>
+        </w:rPr>
+        <w:t xml:space="preserve">105  |  </w:t>
+      </w:r>
+      <w:r>
+        <w:rPr>
+          <w:rFonts w:ascii="Calibri" w:cs="Calibri" w:eastAsia="Calibri" w:hAnsi="Calibri"/>
+          <w:b/>
+          <w:bCs/>
+          <w:i w:val="false"/>
+          <w:iCs w:val="false"/>
+          <w:color w:val="1a1a2e"/>
+          <w:sz w:val="20"/>
+          <w:szCs w:val="20"/>
+        </w:rPr>
+        <w:t xml:space="preserve">CPL: </w:t>
+      </w:r>
+      <w:r>
+        <w:rPr>
+          <w:rFonts w:ascii="Calibri" w:cs="Calibri" w:eastAsia="Calibri" w:hAnsi="Calibri"/>
+          <w:b w:val="false"/>
+          <w:bCs w:val="false"/>
+          <w:i w:val="false"/>
+          <w:iCs w:val="false"/>
+          <w:color w:val="3a3a3a"/>
+          <w:sz w:val="20"/>
+          <w:szCs w:val="20"/>
+        </w:rPr>
+        <w:t xml:space="preserve">$0.52  |  </w:t>
+      </w:r>
+      <w:r>
+        <w:rPr>
+          <w:rFonts w:ascii="Calibri" w:cs="Calibri" w:eastAsia="Calibri" w:hAnsi="Calibri"/>
+          <w:b/>
+          <w:bCs/>
+          <w:i w:val="false"/>
+          <w:iCs w:val="false"/>
+          <w:color w:val="1a1a2e"/>
+          <w:sz w:val="20"/>
+          <w:szCs w:val="20"/>
+        </w:rPr>
+        <w:t xml:space="preserve">CTR: </w:t>
+      </w:r>
+      <w:r>
+        <w:rPr>
+          <w:rFonts w:ascii="Calibri" w:cs="Calibri" w:eastAsia="Calibri" w:hAnsi="Calibri"/>
+          <w:b w:val="false"/>
+          <w:bCs w:val="false"/>
+          <w:i w:val="false"/>
+          <w:iCs w:val="false"/>
+          <w:color w:val="3a3a3a"/>
+          <w:sz w:val="20"/>
+          <w:szCs w:val="20"/>
+        </w:rPr>
+        <w:t xml:space="preserve">6.24%</w:t>
+      </w:r>
+    </w:p>
+    <w:p>
+      <w:pPr>
+        <w:spacing w:after="50"/>
+        <w:ind w:left="360"/>
+      </w:pPr>
+      <w:r>
+        <w:rPr>
+          <w:rFonts w:ascii="Calibri" w:cs="Calibri" w:eastAsia="Calibri" w:hAnsi="Calibri"/>
+          <w:color w:val="2d5f8a"/>
+          <w:sz w:val="20"/>
+          <w:szCs w:val="20"/>
+        </w:rPr>
+        <w:t xml:space="preserve">▸ </w:t>
+      </w:r>
+      <w:r>
+        <w:rPr>
+          <w:rFonts w:ascii="Calibri" w:cs="Calibri" w:eastAsia="Calibri" w:hAnsi="Calibri"/>
+          <w:b/>
+          <w:bCs/>
+          <w:i w:val="false"/>
+          <w:iCs w:val="false"/>
+          <w:color w:val="1a1a2e"/>
+          <w:sz w:val="20"/>
+          <w:szCs w:val="20"/>
+        </w:rPr>
+        <w:t xml:space="preserve">Ventas: </w:t>
+      </w:r>
+      <w:r>
+        <w:rPr>
+          <w:rFonts w:ascii="Calibri" w:cs="Calibri" w:eastAsia="Calibri" w:hAnsi="Calibri"/>
+          <w:b w:val="false"/>
+          <w:bCs w:val="false"/>
+          <w:i w:val="false"/>
+          <w:iCs w:val="false"/>
+          <w:color w:val="3a3a3a"/>
+          <w:sz w:val="20"/>
+          <w:szCs w:val="20"/>
+        </w:rPr>
+        <w:t xml:space="preserve">15 (producto de $7)  |  </w:t>
+      </w:r>
+      <w:r>
+        <w:rPr>
+          <w:rFonts w:ascii="Calibri" w:cs="Calibri" w:eastAsia="Calibri" w:hAnsi="Calibri"/>
+          <w:b/>
+          <w:bCs/>
+          <w:i w:val="false"/>
+          <w:iCs w:val="false"/>
+          <w:color w:val="1a1a2e"/>
+          <w:sz w:val="20"/>
+          <w:szCs w:val="20"/>
+        </w:rPr>
+        <w:t xml:space="preserve">Facturación: </w:t>
+      </w:r>
+      <w:r>
+        <w:rPr>
+          <w:rFonts w:ascii="Calibri" w:cs="Calibri" w:eastAsia="Calibri" w:hAnsi="Calibri"/>
+          <w:b w:val="false"/>
+          <w:bCs w:val="false"/>
+          <w:i w:val="false"/>
+          <w:iCs w:val="false"/>
+          <w:color w:val="3a3a3a"/>
+          <w:sz w:val="20"/>
+          <w:szCs w:val="20"/>
+        </w:rPr>
+        <w:t xml:space="preserve">$105  |  </w:t>
+      </w:r>
+      <w:r>
+        <w:rPr>
+          <w:rFonts w:ascii="Calibri" w:cs="Calibri" w:eastAsia="Calibri" w:hAnsi="Calibri"/>
+          <w:b/>
+          <w:bCs/>
+          <w:i w:val="false"/>
+          <w:iCs w:val="false"/>
+          <w:color w:val="1a1a2e"/>
+          <w:sz w:val="20"/>
+          <w:szCs w:val="20"/>
+        </w:rPr>
+        <w:t xml:space="preserve">ROAS: </w:t>
+      </w:r>
+      <w:r>
+        <w:rPr>
+          <w:rFonts w:ascii="Calibri" w:cs="Calibri" w:eastAsia="Calibri" w:hAnsi="Calibri"/>
+          <w:b w:val="false"/>
+          <w:bCs w:val="false"/>
+          <w:i w:val="false"/>
+          <w:iCs w:val="false"/>
+          <w:color w:val="3a3a3a"/>
+          <w:sz w:val="20"/>
+          <w:szCs w:val="20"/>
+        </w:rPr>
+        <w:t xml:space="preserve">1.93x  |  </w:t>
+      </w:r>
+      <w:r>
+        <w:rPr>
+          <w:rFonts w:ascii="Calibri" w:cs="Calibri" w:eastAsia="Calibri" w:hAnsi="Calibri"/>
+          <w:b/>
+          <w:bCs/>
+          <w:i w:val="false"/>
+          <w:iCs w:val="false"/>
+          <w:color w:val="1a1a2e"/>
+          <w:sz w:val="20"/>
+          <w:szCs w:val="20"/>
+        </w:rPr>
+        <w:t xml:space="preserve">Costo/venta: </w:t>
+      </w:r>
+      <w:r>
+        <w:rPr>
+          <w:rFonts w:ascii="Calibri" w:cs="Calibri" w:eastAsia="Calibri" w:hAnsi="Calibri"/>
+          <w:b w:val="false"/>
+          <w:bCs w:val="false"/>
+          <w:i w:val="false"/>
+          <w:iCs w:val="false"/>
+          <w:color w:val="3a3a3a"/>
+          <w:sz w:val="20"/>
+          <w:szCs w:val="20"/>
+        </w:rPr>
+        <w:t xml:space="preserve">$3.63</w:t>
+      </w:r>
+    </w:p>
+    <w:p>
+      <w:pPr>
+        <w:spacing w:after="50"/>
+        <w:ind w:left="360"/>
+      </w:pPr>
+      <w:r>
+        <w:rPr>
+          <w:rFonts w:ascii="Calibri" w:cs="Calibri" w:eastAsia="Calibri" w:hAnsi="Calibri"/>
+          <w:color w:val="2d5f8a"/>
+          <w:sz w:val="20"/>
+          <w:szCs w:val="20"/>
+        </w:rPr>
+        <w:t xml:space="preserve">▸ </w:t>
+      </w:r>
+      <w:r>
+        <w:rPr>
+          <w:rFonts w:ascii="Calibri" w:cs="Calibri" w:eastAsia="Calibri" w:hAnsi="Calibri"/>
+          <w:b/>
+          <w:bCs/>
+          <w:i w:val="false"/>
+          <w:iCs w:val="false"/>
+          <w:color w:val="1a1a2e"/>
+          <w:sz w:val="20"/>
+          <w:szCs w:val="20"/>
+        </w:rPr>
+        <w:t xml:space="preserve">Insight de optimización: </w:t>
+      </w:r>
+      <w:r>
+        <w:rPr>
+          <w:rFonts w:ascii="Calibri" w:cs="Calibri" w:eastAsia="Calibri" w:hAnsi="Calibri"/>
+          <w:b w:val="false"/>
+          <w:bCs w:val="false"/>
+          <w:i w:val="false"/>
+          <w:iCs w:val="false"/>
+          <w:color w:val="3a3a3a"/>
+          <w:sz w:val="20"/>
+          <w:szCs w:val="20"/>
+        </w:rPr>
+        <w:t xml:space="preserve">Interrupciones por pago permitieron analizar el impacto de la continuidad en la entrega del algoritmo, confirmando que las pausas degradaban el CPL significativamente.</w:t>
+      </w:r>
+    </w:p>
+    <w:p>
+      <w:pPr>
+        <w:spacing w:after="40" w:before="0"/>
+        <w:jc w:val="left"/>
+      </w:pPr>
+      <w:r>
+        <w:rPr>
+          <w:rFonts w:ascii="Calibri" w:cs="Calibri" w:eastAsia="Calibri" w:hAnsi="Calibri"/>
+          <w:b w:val="false"/>
+          <w:bCs w:val="false"/>
+          <w:i w:val="false"/>
+          <w:iCs w:val="false"/>
+          <w:color w:val="3a3a3a"/>
+          <w:sz w:val="21"/>
+          <w:szCs w:val="21"/>
+        </w:rPr>
+        <w:t xml:space="preserve"/>
+      </w:r>
+    </w:p>
+    <w:p>
+      <w:pPr>
+        <w:spacing w:after="80" w:before="0"/>
+        <w:jc w:val="left"/>
+      </w:pPr>
+      <w:r>
+        <w:rPr>
+          <w:rFonts w:ascii="Calibri" w:cs="Calibri" w:eastAsia="Calibri" w:hAnsi="Calibri"/>
+          <w:b/>
+          <w:bCs/>
+          <w:i w:val="false"/>
+          <w:iCs w:val="false"/>
+          <w:color w:val="2d5f8a"/>
+          <w:sz w:val="20"/>
+          <w:szCs w:val="20"/>
+        </w:rPr>
+        <w:t xml:space="preserve">Proyección estratégica a High Ticket </w:t>
+      </w:r>
+      <w:r>
+        <w:rPr>
+          <w:rFonts w:ascii="Calibri" w:cs="Calibri" w:eastAsia="Calibri" w:hAnsi="Calibri"/>
+          <w:b w:val="false"/>
+          <w:bCs w:val="false"/>
+          <w:i/>
+          <w:iCs/>
+          <w:color w:val="666666"/>
+          <w:sz w:val="20"/>
+          <w:szCs w:val="20"/>
+        </w:rPr>
+        <w:t xml:space="preserve">(modelo de escalado basado en los mismos fundamentos de captación):</w:t>
+      </w:r>
+    </w:p>
+    <w:p>
+      <w:pPr>
+        <w:spacing w:after="50"/>
+        <w:ind w:left="360"/>
+      </w:pPr>
+      <w:r>
+        <w:rPr>
+          <w:rFonts w:ascii="Calibri" w:cs="Calibri" w:eastAsia="Calibri" w:hAnsi="Calibri"/>
+          <w:color w:val="2d5f8a"/>
+          <w:sz w:val="20"/>
+          <w:szCs w:val="20"/>
+        </w:rPr>
+        <w:t xml:space="preserve">▸ </w:t>
+      </w:r>
+      <w:r>
+        <w:rPr>
+          <w:rFonts w:ascii="Calibri" w:cs="Calibri" w:eastAsia="Calibri" w:hAnsi="Calibri"/>
+          <w:b/>
+          <w:bCs/>
+          <w:i w:val="false"/>
+          <w:iCs w:val="false"/>
+          <w:color w:val="1a1a2e"/>
+          <w:sz w:val="20"/>
+          <w:szCs w:val="20"/>
+        </w:rPr>
+        <w:t xml:space="preserve">Con el mismo CPL de $0.52: </w:t>
+      </w:r>
+      <w:r>
+        <w:rPr>
+          <w:rFonts w:ascii="Calibri" w:cs="Calibri" w:eastAsia="Calibri" w:hAnsi="Calibri"/>
+          <w:b w:val="false"/>
+          <w:bCs w:val="false"/>
+          <w:i w:val="false"/>
+          <w:iCs w:val="false"/>
+          <w:color w:val="3a3a3a"/>
+          <w:sz w:val="20"/>
+          <w:szCs w:val="20"/>
+        </w:rPr>
+        <w:t xml:space="preserve">una inversión de $500 genera ~960 leads. Aplicando un filtro de cualificación del 15% = 144 prospectos cualificados.</w:t>
+      </w:r>
+    </w:p>
+    <w:p>
+      <w:pPr>
+        <w:spacing w:after="50"/>
+        <w:ind w:left="360"/>
+      </w:pPr>
+      <w:r>
+        <w:rPr>
+          <w:rFonts w:ascii="Calibri" w:cs="Calibri" w:eastAsia="Calibri" w:hAnsi="Calibri"/>
+          <w:color w:val="2d5f8a"/>
+          <w:sz w:val="20"/>
+          <w:szCs w:val="20"/>
+        </w:rPr>
+        <w:t xml:space="preserve">▸ </w:t>
+      </w:r>
+      <w:r>
+        <w:rPr>
+          <w:rFonts w:ascii="Calibri" w:cs="Calibri" w:eastAsia="Calibri" w:hAnsi="Calibri"/>
+          <w:b/>
+          <w:bCs/>
+          <w:i w:val="false"/>
+          <w:iCs w:val="false"/>
+          <w:color w:val="1a1a2e"/>
+          <w:sz w:val="20"/>
+          <w:szCs w:val="20"/>
+        </w:rPr>
+        <w:t xml:space="preserve">Con agendamiento del 30% sobre cualificados: </w:t>
+      </w:r>
+      <w:r>
+        <w:rPr>
+          <w:rFonts w:ascii="Calibri" w:cs="Calibri" w:eastAsia="Calibri" w:hAnsi="Calibri"/>
+          <w:b w:val="false"/>
+          <w:bCs w:val="false"/>
+          <w:i w:val="false"/>
+          <w:iCs w:val="false"/>
+          <w:color w:val="3a3a3a"/>
+          <w:sz w:val="20"/>
+          <w:szCs w:val="20"/>
+        </w:rPr>
+        <w:t xml:space="preserve">43 llamadas agendadas. Con mi tasa de cierre del 37% = 16 clientes.</w:t>
+      </w:r>
+    </w:p>
+    <w:p>
+      <w:pPr>
+        <w:spacing w:after="50"/>
+        <w:ind w:left="360"/>
+      </w:pPr>
+      <w:r>
+        <w:rPr>
+          <w:rFonts w:ascii="Calibri" w:cs="Calibri" w:eastAsia="Calibri" w:hAnsi="Calibri"/>
+          <w:color w:val="2d5f8a"/>
+          <w:sz w:val="20"/>
+          <w:szCs w:val="20"/>
+        </w:rPr>
+        <w:t xml:space="preserve">▸ </w:t>
+      </w:r>
+      <w:r>
+        <w:rPr>
+          <w:rFonts w:ascii="Calibri" w:cs="Calibri" w:eastAsia="Calibri" w:hAnsi="Calibri"/>
+          <w:b/>
+          <w:bCs/>
+          <w:i w:val="false"/>
+          <w:iCs w:val="false"/>
+          <w:color w:val="1a1a2e"/>
+          <w:sz w:val="20"/>
+          <w:szCs w:val="20"/>
+        </w:rPr>
+        <w:t xml:space="preserve">Con ticket promedio de $1,500: </w:t>
+      </w:r>
+      <w:r>
+        <w:rPr>
+          <w:rFonts w:ascii="Calibri" w:cs="Calibri" w:eastAsia="Calibri" w:hAnsi="Calibri"/>
+          <w:b w:val="false"/>
+          <w:bCs w:val="false"/>
+          <w:i w:val="false"/>
+          <w:iCs w:val="false"/>
+          <w:color w:val="3a3a3a"/>
+          <w:sz w:val="20"/>
+          <w:szCs w:val="20"/>
+        </w:rPr>
+        <w:t xml:space="preserve">facturación proyectada de $24,000 con $500 de inversión → ROAS 48x.</w:t>
+      </w:r>
+    </w:p>
+    <w:p>
+      <w:pPr>
+        <w:spacing w:after="50"/>
+        <w:ind w:left="360"/>
+      </w:pPr>
+      <w:r>
+        <w:rPr>
+          <w:rFonts w:ascii="Calibri" w:cs="Calibri" w:eastAsia="Calibri" w:hAnsi="Calibri"/>
+          <w:color w:val="2d5f8a"/>
+          <w:sz w:val="20"/>
+          <w:szCs w:val="20"/>
+        </w:rPr>
+        <w:t xml:space="preserve">▸ </w:t>
+      </w:r>
+      <w:r>
+        <w:rPr>
+          <w:rFonts w:ascii="Calibri" w:cs="Calibri" w:eastAsia="Calibri" w:hAnsi="Calibri"/>
+          <w:b/>
+          <w:bCs/>
+          <w:i w:val="false"/>
+          <w:iCs w:val="false"/>
+          <w:color w:val="1a1a2e"/>
+          <w:sz w:val="20"/>
+          <w:szCs w:val="20"/>
+        </w:rPr>
+        <w:t xml:space="preserve">Enfoque actual: </w:t>
+      </w:r>
+      <w:r>
+        <w:rPr>
+          <w:rFonts w:ascii="Calibri" w:cs="Calibri" w:eastAsia="Calibri" w:hAnsi="Calibri"/>
+          <w:b w:val="false"/>
+          <w:bCs w:val="false"/>
+          <w:i w:val="false"/>
+          <w:iCs w:val="false"/>
+          <w:color w:val="3a3a3a"/>
+          <w:sz w:val="20"/>
+          <w:szCs w:val="20"/>
+        </w:rPr>
+        <w:t xml:space="preserve">Profundizando en la parte del funnel HT que no existe en LT — captación, nutrición, agendamiento y conversión mediante llamada — aplicando el mismo rigor de medición que demostré en el caso Low Ticket.</w:t>
       </w:r>
     </w:p>
     <w:p>

</xml_diff>